<commit_message>
Fix lab3 report: add placeholder for ideas list table in section 4.2
Co-Authored-By: Claude Sonnet 4.6 <noreply@anthropic.com>
Claude-Session: https://claude.ai/code/session_01U4SrxRhEfFmrVk7DiAcxzL
</commit_message>
<xml_diff>
--- a/lab3_report.docx
+++ b/lab3_report.docx
@@ -469,6 +469,30 @@
           <w:sz w:val="28"/>
         </w:rPr>
         <w:t>За результатами структурованого брейнштормінгу було зафіксовано 10 ідей нового функціоналу та покращень. Кожна ідея сформульована у форматі: назва → короткий опис → ключова гіпотеза → метрика оцінювання результату.</w:t>
+      </w:r>
+    </w:p>
+    <w:p>
+      <w:pPr>
+        <w:spacing w:before="160" w:after="160"/>
+        <w:ind w:firstLine="0"/>
+        <w:jc w:val="center"/>
+        <w:pBdr>
+          <w:top w:val="single" w:sz="6" w:space="4" w:color="888888"/>
+          <w:left w:val="single" w:sz="6" w:space="4" w:color="888888"/>
+          <w:bottom w:val="single" w:sz="6" w:space="4" w:color="888888"/>
+          <w:right w:val="single" w:sz="6" w:space="4" w:color="888888"/>
+        </w:pBdr>
+      </w:pPr>
+      <w:r>
+        <w:rPr>
+          <w:rFonts w:ascii="Times New Roman" w:hAnsi="Times New Roman" w:cs="Times New Roman"/>
+          <w:rFonts w:ascii="Times New Roman" w:hAnsi="Times New Roman"/>
+          <w:b w:val="0"/>
+          <w:i/>
+          <w:color w:val="505050"/>
+          <w:sz w:val="24"/>
+        </w:rPr>
+        <w:t>[ Таблиця 4.2 — Повний список згенерованих ідей (Excel, аркуш «Список ідей») ]</w:t>
       </w:r>
     </w:p>
     <w:p>

</xml_diff>